<commit_message>
Close three open decisions: wontfix accepted, org stays on Team, Linear Free syncs
- check_a1.py grades the four labels a student creates, reports wontfix as a
  note (fails only if deleted), and retries gh label list for propagation lag.
  Exercised against flashcards-seed and a nonexistent repo.
- Linear: linear.app/pricing lists Issue sync as a Core feature on every plan;
  the docs gate only GitHub Enterprise Cloud and AI magic-word enrichment.
  M12 is written on the Free assumption; one live check remains a TODO.
- Org plan: stay on Team for now; seats must be bought before inviting.
- NOTES.md, adr/0003, instructor guide, A1 item 4, README, and the roadmap
  updated to match. Roadmap regenerated (24 items, one DECIDE left).

Co-Authored-By: Claude Opus 5 (1M context) <noreply@anthropic.com>
Claude-Session: https://claude.ai/code/session_01XtNkkAc1pk23sHWJwKeCDF
</commit_message>
<xml_diff>
--- a/roadmap/roadmap.docx
+++ b/roadmap/roadmap.docx
@@ -24,7 +24,7 @@
           <w:color w:val="666666"/>
           <w:sz w:val="22"/>
         </w:rPr>
-        <w:t>Build roadmap  ·  as of 2026-09-12</w:t>
+        <w:t>Build roadmap  ·  as of 2026-09-13</w:t>
       </w:r>
     </w:p>
     <w:p>
@@ -45,7 +45,7 @@
           <w:color w:val="1B7F3B"/>
           <w:sz w:val="18"/>
         </w:rPr>
-        <w:t>DONE 5</w:t>
+        <w:t>DONE 9</w:t>
       </w:r>
       <w:r>
         <w:t xml:space="preserve">    </w:t>
@@ -67,7 +67,7 @@
           <w:color w:val="444444"/>
           <w:sz w:val="18"/>
         </w:rPr>
-        <w:t>TODO 10</w:t>
+        <w:t>TODO 12</w:t>
       </w:r>
       <w:r>
         <w:t xml:space="preserve">    </w:t>
@@ -89,7 +89,7 @@
           <w:color w:val="A56A00"/>
           <w:sz w:val="18"/>
         </w:rPr>
-        <w:t>DECIDE 4</w:t>
+        <w:t>DECIDE 1</w:t>
       </w:r>
     </w:p>
     <w:p>
@@ -858,6 +858,106 @@
           </w:p>
         </w:tc>
       </w:tr>
+      <w:tr>
+        <w:tc>
+          <w:tcPr>
+            <w:tcW w:type="dxa" w:w="1224"/>
+            <w:shd w:val="clear" w:fill="F4F2F9"/>
+          </w:tcPr>
+          <w:p>
+            <w:pPr>
+              <w:jc w:val="center"/>
+            </w:pPr>
+            <w:r>
+              <w:rPr>
+                <w:b/>
+                <w:color w:val="1B7F3B"/>
+                <w:sz w:val="16"/>
+              </w:rPr>
+              <w:t>DONE</w:t>
+            </w:r>
+          </w:p>
+        </w:tc>
+        <w:tc>
+          <w:tcPr>
+            <w:tcW w:type="dxa" w:w="8424"/>
+          </w:tcPr>
+          <w:p>
+            <w:pPr>
+              <w:spacing w:after="20"/>
+            </w:pPr>
+            <w:r>
+              <w:rPr>
+                <w:b/>
+                <w:sz w:val="21"/>
+              </w:rPr>
+              <w:t>check_a1.py grades four labels and notes wontfix</w:t>
+            </w:r>
+          </w:p>
+          <w:p>
+            <w:pPr>
+              <w:spacing w:after="0"/>
+            </w:pPr>
+            <w:r>
+              <w:rPr>
+                <w:color w:val="333333"/>
+                <w:sz w:val="19"/>
+              </w:rPr>
+              <w:t>Follows from the triage-label decision. The item now reads 'Triage labels (4 created + 1 default)', wontfix is a note unless deleted, and gh label list is retried over ~9 s to cover propagation lag. Exercised against flashcards-seed and a nonexistent repo.</w:t>
+            </w:r>
+          </w:p>
+        </w:tc>
+      </w:tr>
+      <w:tr>
+        <w:tc>
+          <w:tcPr>
+            <w:tcW w:type="dxa" w:w="1224"/>
+            <w:shd w:val="clear" w:fill="F4F2F9"/>
+          </w:tcPr>
+          <w:p>
+            <w:pPr>
+              <w:jc w:val="center"/>
+            </w:pPr>
+            <w:r>
+              <w:rPr>
+                <w:b/>
+                <w:color w:val="444444"/>
+                <w:sz w:val="16"/>
+              </w:rPr>
+              <w:t>TODO</w:t>
+            </w:r>
+          </w:p>
+        </w:tc>
+        <w:tc>
+          <w:tcPr>
+            <w:tcW w:type="dxa" w:w="8424"/>
+          </w:tcPr>
+          <w:p>
+            <w:pPr>
+              <w:spacing w:after="20"/>
+            </w:pPr>
+            <w:r>
+              <w:rPr>
+                <w:b/>
+                <w:sz w:val="21"/>
+              </w:rPr>
+              <w:t>Confirm Issues Sync live in a Free Linear workspace</w:t>
+            </w:r>
+          </w:p>
+          <w:p>
+            <w:pPr>
+              <w:spacing w:after="0"/>
+            </w:pPr>
+            <w:r>
+              <w:rPr>
+                <w:color w:val="333333"/>
+                <w:sz w:val="19"/>
+              </w:rPr>
+              <w:t>Settings &gt; Integrations &gt; GitHub &gt; GitHub Issues shows the + to link a repo. Do it when the instructor workspace is created (guide Part 5.2), before M12 is finalised.</w:t>
+            </w:r>
+          </w:p>
+        </w:tc>
+      </w:tr>
     </w:tbl>
     <w:p>
       <w:pPr>
@@ -869,7 +969,7 @@
           <w:color w:val="6D4AB8"/>
           <w:sz w:val="28"/>
         </w:rPr>
-        <w:t>Decisions you owe</w:t>
+        <w:t>Decisions</w:t>
       </w:r>
     </w:p>
     <w:p>
@@ -882,7 +982,7 @@
           <w:color w:val="666666"/>
           <w:sz w:val="19"/>
         </w:rPr>
-        <w:t>None of these are mine to make, and each blocks something concrete.</w:t>
+        <w:t>Three were made on 2026-09-13; one is still owed. The reasoning is in NOTES.md.</w:t>
       </w:r>
     </w:p>
     <w:tbl>
@@ -910,10 +1010,10 @@
             <w:r>
               <w:rPr>
                 <w:b/>
-                <w:color w:val="A56A00"/>
+                <w:color w:val="1B7F3B"/>
                 <w:sz w:val="16"/>
               </w:rPr>
-              <w:t>DECIDE</w:t>
+              <w:t>DONE</w:t>
             </w:r>
           </w:p>
         </w:tc>
@@ -930,7 +1030,7 @@
                 <w:b/>
                 <w:sz w:val="21"/>
               </w:rPr>
-              <w:t>Linear Free plan: does it include GitHub Issues Sync?</w:t>
+              <w:t>Org plan: stay on Team for now</w:t>
             </w:r>
           </w:p>
           <w:p>
@@ -942,7 +1042,7 @@
                 <w:color w:val="333333"/>
                 <w:sz w:val="19"/>
               </w:rPr>
-              <w:t>Blocks the final wording of M12, the last objective of Week 2. If Sync is paid-only, M12 falls back to PR/commit linking alone and Week 6's sync content becomes instructor-demoed. Confirm against linear.app/pricing with a real Free workspace.</w:t>
+              <w:t>Decided 2026-09-13. Re-checked: still Team, 2 seats, 1 filled. Nothing in the curriculum depends on the tier, so the consequence is operational: seats must be bought before inviting (see below). Downgrading to Free remains the recommendation to revisit before cohort 2.</w:t>
             </w:r>
           </w:p>
         </w:tc>
@@ -960,10 +1060,10 @@
             <w:r>
               <w:rPr>
                 <w:b/>
-                <w:color w:val="A56A00"/>
+                <w:color w:val="1B7F3B"/>
                 <w:sz w:val="16"/>
               </w:rPr>
-              <w:t>DECIDE</w:t>
+              <w:t>DONE</w:t>
             </w:r>
           </w:p>
         </w:tc>
@@ -980,7 +1080,7 @@
                 <w:b/>
                 <w:sz w:val="21"/>
               </w:rPr>
-              <w:t>Org plan: pay for Team seats, or downgrade to Free?</w:t>
+              <w:t>The fifth triage label is free: accepted</w:t>
             </w:r>
           </w:p>
           <w:p>
@@ -992,7 +1092,7 @@
                 <w:color w:val="333333"/>
                 <w:sz w:val="19"/>
               </w:rPr>
-              <w:t>perro-ruidoso is on Team with 2 seats, 1 filled. A cohort of 8-14 plus the instructor needs 9-15 at $4/user/month. Downgrading costs the curriculum nothing -- every gate the course uses works on a public repo at either tier. Decide before inviting students.</w:t>
+              <w:t>Decided 2026-09-13. wontfix is a GitHub default, so A1 item 4 assesses four labels, not five, and the checker and A1 now say so. Renaming the role would fork the Pocock skill's vocabulary; asserting an edit would grade a colour change, not understanding.</w:t>
             </w:r>
           </w:p>
         </w:tc>
@@ -1010,10 +1110,10 @@
             <w:r>
               <w:rPr>
                 <w:b/>
-                <w:color w:val="A56A00"/>
+                <w:color w:val="1B7F3B"/>
                 <w:sz w:val="16"/>
               </w:rPr>
-              <w:t>DECIDE</w:t>
+              <w:t>DONE</w:t>
             </w:r>
           </w:p>
         </w:tc>
@@ -1030,7 +1130,7 @@
                 <w:b/>
                 <w:sz w:val="21"/>
               </w:rPr>
-              <w:t>The fifth triage label is free</w:t>
+              <w:t>Linear Free includes GitHub Issues Sync</w:t>
             </w:r>
           </w:p>
           <w:p>
@@ -1042,7 +1142,7 @@
                 <w:color w:val="333333"/>
                 <w:sz w:val="19"/>
               </w:rPr>
-              <w:t>wontfix is in GitHub's default label set, so A1 item 4 assesses four labels, not five, and no change to the template can fix it. Options: accept it; rename the fifth role to something outside the defaults; or have check_a1.py assert the label was deliberately edited.</w:t>
+              <w:t>Decided 2026-09-13 on the evidence of linear.app/pricing: Issue sync is a Core feature on every plan; the docs gate only GitHub Enterprise Cloud and AI magic-word enrichment. Free caps at 2 teams and 250 issues, ample for one Instance. M12 is written on the Free assumption; one live check remains under Infrastructure.</w:t>
             </w:r>
           </w:p>
         </w:tc>
@@ -1182,6 +1282,56 @@
                 <w:sz w:val="19"/>
               </w:rPr>
               <w:t>Required by adr/0003 before enrolment, not after.</w:t>
+            </w:r>
+          </w:p>
+        </w:tc>
+      </w:tr>
+      <w:tr>
+        <w:tc>
+          <w:tcPr>
+            <w:tcW w:type="dxa" w:w="1224"/>
+            <w:shd w:val="clear" w:fill="F4F2F9"/>
+          </w:tcPr>
+          <w:p>
+            <w:pPr>
+              <w:jc w:val="center"/>
+            </w:pPr>
+            <w:r>
+              <w:rPr>
+                <w:b/>
+                <w:color w:val="444444"/>
+                <w:sz w:val="16"/>
+              </w:rPr>
+              <w:t>TODO</w:t>
+            </w:r>
+          </w:p>
+        </w:tc>
+        <w:tc>
+          <w:tcPr>
+            <w:tcW w:type="dxa" w:w="8424"/>
+          </w:tcPr>
+          <w:p>
+            <w:pPr>
+              <w:spacing w:after="20"/>
+            </w:pPr>
+            <w:r>
+              <w:rPr>
+                <w:b/>
+                <w:sz w:val="21"/>
+              </w:rPr>
+              <w:t>Buy Team seats for the cohort</w:t>
+            </w:r>
+          </w:p>
+          <w:p>
+            <w:pPr>
+              <w:spacing w:after="0"/>
+            </w:pPr>
+            <w:r>
+              <w:rPr>
+                <w:color w:val="333333"/>
+                <w:sz w:val="19"/>
+              </w:rPr>
+              <w:t>The org has 2 seats and stays on Team; a cohort of 8-14 plus the instructor needs 9-15. Settings &gt; Billing and licensing, then confirm with gh api orgs/perro-ruidoso --jq .plan. Invitations beyond the seat count will not go through.</w:t>
             </w:r>
           </w:p>
         </w:tc>

</xml_diff>